<commit_message>
updated lab 3 report
</commit_message>
<xml_diff>
--- a/docs/labs/Lab3-human-peripheral-circulation-dive-response/Lab3.docx
+++ b/docs/labs/Lab3-human-peripheral-circulation-dive-response/Lab3.docx
@@ -23,7 +23,7 @@
         <w:pStyle w:val="Date"/>
       </w:pPr>
       <w:r>
-        <w:t xml:space="preserve">2024-09-10</w:t>
+        <w:t xml:space="preserve">2025-10-01</w:t>
       </w:r>
     </w:p>
     <w:sdt>
@@ -163,6 +163,31 @@
               <w:bottom w:w="108" w:type="dxa"/>
             </w:tcMar>
           </w:tcPr>
+          <w:p>
+            <w:pPr>
+              <w:pStyle w:val="Compact"/>
+              <w:numPr>
+                <w:ilvl w:val="0"/>
+                <w:numId w:val="1001"/>
+              </w:numPr>
+            </w:pPr>
+            <w:r>
+              <w:t xml:space="preserve">We will do the</w:t>
+            </w:r>
+            <w:r>
+              <w:t xml:space="preserve"> </w:t>
+            </w:r>
+            <w:r>
+              <w:rPr>
+                <w:i/>
+                <w:iCs/>
+              </w:rPr>
+              <w:t xml:space="preserve">Practical based on Lab 1 material</w:t>
+            </w:r>
+            <w:r>
+              <w:t xml:space="preserve">. Let us know if you want tor come in to practice ahead of time.</w:t>
+            </w:r>
+          </w:p>
           <w:p>
             <w:pPr>
               <w:pStyle w:val="Compact"/>
@@ -7289,59 +7314,18 @@
         </w:numPr>
       </w:pPr>
       <w:r>
-        <w:t xml:space="preserve">You will work with your lab group to analyze data, and you may share figures if you wish. However, each person will submit an</w:t>
-      </w:r>
-      <w:r>
-        <w:t xml:space="preserve"> </w:t>
-      </w:r>
-      <w:r>
-        <w:rPr>
-          <w:b/>
-          <w:bCs/>
-        </w:rPr>
-        <w:t xml:space="preserve">Individual WorkSheet</w:t>
-      </w:r>
-      <w:r>
-        <w:t xml:space="preserve"> </w:t>
-      </w:r>
-      <w:r>
-        <w:t xml:space="preserve">[</w:t>
+        <w:t xml:space="preserve">Write a Group Lab Report following [</w:t>
       </w:r>
       <w:hyperlink r:id="rId100">
         <w:r>
           <w:rPr>
             <w:rStyle w:val="Hyperlink"/>
           </w:rPr>
-          <w:t xml:space="preserve">html</w:t>
+          <w:t xml:space="preserve">Peripheral Circulation Report Guidance</w:t>
         </w:r>
       </w:hyperlink>
       <w:r>
         <w:t xml:space="preserve">]</w:t>
-      </w:r>
-    </w:p>
-    <w:p>
-      <w:pPr>
-        <w:pStyle w:val="Compact"/>
-        <w:numPr>
-          <w:ilvl w:val="0"/>
-          <w:numId w:val="1029"/>
-        </w:numPr>
-      </w:pPr>
-      <w:r>
-        <w:t xml:space="preserve">Reminder:</w:t>
-      </w:r>
-      <w:r>
-        <w:t xml:space="preserve"> </w:t>
-      </w:r>
-      <w:r>
-        <w:rPr>
-          <w:i/>
-          <w:iCs/>
-        </w:rPr>
-        <w:t xml:space="preserve">Practical has been moved to next week (week 4) on Lab 1 material</w:t>
-      </w:r>
-      <w:r>
-        <w:t xml:space="preserve">. Let us know if you want to come in to practice.</w:t>
       </w:r>
     </w:p>
     <w:bookmarkStart w:id="102" w:name="refs"/>

</xml_diff>